<commit_message>
Implemented roles to servers
</commit_message>
<xml_diff>
--- a/Explanation.docx
+++ b/Explanation.docx
@@ -58,7 +58,52 @@
           <w:sz w:val="28"/>
           <w:szCs w:val="28"/>
         </w:rPr>
-        <w:t>Step 1 – create a dictonary that sits on a server.</w:t>
+        <w:t xml:space="preserve">Phase 1- </w:t>
+      </w:r>
+      <w:r>
+        <w:rPr>
+          <w:sz w:val="28"/>
+          <w:szCs w:val="28"/>
+        </w:rPr>
+        <w:t>a persistent, concurrent, networked key-value store. Your data now survives crashes and restarts.</w:t>
+      </w:r>
+      <w:r>
+        <w:rPr>
+          <w:sz w:val="28"/>
+          <w:szCs w:val="28"/>
+        </w:rPr>
+        <w:t xml:space="preserve"> - done</w:t>
+      </w:r>
+    </w:p>
+    <w:p>
+      <w:pPr>
+        <w:rPr>
+          <w:sz w:val="28"/>
+          <w:szCs w:val="28"/>
+        </w:rPr>
+      </w:pPr>
+      <w:r>
+        <w:rPr>
+          <w:sz w:val="28"/>
+          <w:szCs w:val="28"/>
+        </w:rPr>
+        <w:t xml:space="preserve">Step 1 – create a </w:t>
+      </w:r>
+      <w:proofErr w:type="spellStart"/>
+      <w:r>
+        <w:rPr>
+          <w:sz w:val="28"/>
+          <w:szCs w:val="28"/>
+        </w:rPr>
+        <w:t>dictonary</w:t>
+      </w:r>
+      <w:proofErr w:type="spellEnd"/>
+      <w:r>
+        <w:rPr>
+          <w:sz w:val="28"/>
+          <w:szCs w:val="28"/>
+        </w:rPr>
+        <w:t xml:space="preserve"> that sits on a server.</w:t>
       </w:r>
     </w:p>
     <w:p>
@@ -107,6 +152,7 @@
           <w:szCs w:val="28"/>
         </w:rPr>
       </w:pPr>
+      <w:proofErr w:type="spellStart"/>
       <w:r>
         <w:rPr>
           <w:i/>
@@ -114,32 +160,9 @@
           <w:sz w:val="28"/>
           <w:szCs w:val="28"/>
         </w:rPr>
-        <w:t xml:space="preserve">CommandHandler </w:t>
-      </w:r>
-      <w:proofErr w:type="gramStart"/>
-      <w:r>
-        <w:rPr>
-          <w:sz w:val="28"/>
-          <w:szCs w:val="28"/>
-        </w:rPr>
-        <w:t>-  it’s</w:t>
-      </w:r>
-      <w:proofErr w:type="gramEnd"/>
-      <w:r>
-        <w:rPr>
-          <w:sz w:val="28"/>
-          <w:szCs w:val="28"/>
-        </w:rPr>
-        <w:t xml:space="preserve"> used to translate the commands it gets (SET/GET/DEL) and perform the right operation.</w:t>
-      </w:r>
-    </w:p>
-    <w:p>
-      <w:pPr>
-        <w:rPr>
-          <w:sz w:val="28"/>
-          <w:szCs w:val="28"/>
-        </w:rPr>
-      </w:pPr>
+        <w:t>CommandHandler</w:t>
+      </w:r>
+      <w:proofErr w:type="spellEnd"/>
       <w:r>
         <w:rPr>
           <w:i/>
@@ -147,14 +170,23 @@
           <w:sz w:val="28"/>
           <w:szCs w:val="28"/>
         </w:rPr>
-        <w:t>Store</w:t>
-      </w:r>
-      <w:r>
-        <w:rPr>
-          <w:sz w:val="28"/>
-          <w:szCs w:val="28"/>
-        </w:rPr>
-        <w:t>- which is the actual dictionary storage. Using HashMap. ReadWriteLock to make sure it doesn’t write at the same time.</w:t>
+        <w:t xml:space="preserve"> </w:t>
+      </w:r>
+      <w:proofErr w:type="gramStart"/>
+      <w:r>
+        <w:rPr>
+          <w:sz w:val="28"/>
+          <w:szCs w:val="28"/>
+        </w:rPr>
+        <w:t>-  it’s</w:t>
+      </w:r>
+      <w:proofErr w:type="gramEnd"/>
+      <w:r>
+        <w:rPr>
+          <w:sz w:val="28"/>
+          <w:szCs w:val="28"/>
+        </w:rPr>
+        <w:t xml:space="preserve"> used to translate the commands it gets (SET/GET/DEL) and perform the right operation.</w:t>
       </w:r>
     </w:p>
     <w:p>
@@ -171,7 +203,42 @@
           <w:sz w:val="28"/>
           <w:szCs w:val="28"/>
         </w:rPr>
-        <w:t xml:space="preserve">Walwriter </w:t>
+        <w:t>Store</w:t>
+      </w:r>
+      <w:r>
+        <w:rPr>
+          <w:sz w:val="28"/>
+          <w:szCs w:val="28"/>
+        </w:rPr>
+        <w:t>- which is the actual dictionary storage. Using HashMap. ReadWriteLock to make sure it doesn’t write at the same time.</w:t>
+      </w:r>
+    </w:p>
+    <w:p>
+      <w:pPr>
+        <w:rPr>
+          <w:sz w:val="28"/>
+          <w:szCs w:val="28"/>
+        </w:rPr>
+      </w:pPr>
+      <w:proofErr w:type="spellStart"/>
+      <w:r>
+        <w:rPr>
+          <w:i/>
+          <w:iCs/>
+          <w:sz w:val="28"/>
+          <w:szCs w:val="28"/>
+        </w:rPr>
+        <w:t>Walwriter</w:t>
+      </w:r>
+      <w:proofErr w:type="spellEnd"/>
+      <w:r>
+        <w:rPr>
+          <w:i/>
+          <w:iCs/>
+          <w:sz w:val="28"/>
+          <w:szCs w:val="28"/>
+        </w:rPr>
+        <w:t xml:space="preserve"> </w:t>
       </w:r>
       <w:r>
         <w:rPr>
@@ -203,14 +270,6 @@
           <w:szCs w:val="28"/>
         </w:rPr>
       </w:pPr>
-    </w:p>
-    <w:p>
-      <w:pPr>
-        <w:rPr>
-          <w:sz w:val="28"/>
-          <w:szCs w:val="28"/>
-        </w:rPr>
-      </w:pPr>
       <w:r>
         <w:rPr>
           <w:sz w:val="28"/>
@@ -231,7 +290,23 @@
           <w:sz w:val="28"/>
           <w:szCs w:val="28"/>
         </w:rPr>
-        <w:t>Built the key:value storage.</w:t>
+        <w:t xml:space="preserve">Built the </w:t>
+      </w:r>
+      <w:proofErr w:type="spellStart"/>
+      <w:r>
+        <w:rPr>
+          <w:sz w:val="28"/>
+          <w:szCs w:val="28"/>
+        </w:rPr>
+        <w:t>key:value</w:t>
+      </w:r>
+      <w:proofErr w:type="spellEnd"/>
+      <w:r>
+        <w:rPr>
+          <w:sz w:val="28"/>
+          <w:szCs w:val="28"/>
+        </w:rPr>
+        <w:t xml:space="preserve"> storage.</w:t>
       </w:r>
       <w:r>
         <w:rPr>
@@ -248,34 +323,123 @@
           <w:szCs w:val="28"/>
         </w:rPr>
       </w:pPr>
-      <w:r>
-        <w:rPr>
-          <w:sz w:val="28"/>
-          <w:szCs w:val="28"/>
-        </w:rPr>
-        <w:t xml:space="preserve">KVstore- </w:t>
-      </w:r>
-      <w:r>
-        <w:rPr>
-          <w:sz w:val="28"/>
-          <w:szCs w:val="28"/>
-        </w:rPr>
-        <w:t>has a hashmap and the get set and delete functions. Calls the walwriter object and perfeorms operation non that file too.</w:t>
-      </w:r>
-    </w:p>
-    <w:p>
-      <w:pPr>
-        <w:rPr>
-          <w:sz w:val="28"/>
-          <w:szCs w:val="28"/>
-        </w:rPr>
-      </w:pPr>
-      <w:r>
-        <w:rPr>
-          <w:sz w:val="28"/>
-          <w:szCs w:val="28"/>
-        </w:rPr>
-        <w:t>Set operatioin sets the data in the hashmap and appends it to the log file.</w:t>
+      <w:proofErr w:type="spellStart"/>
+      <w:r>
+        <w:rPr>
+          <w:sz w:val="28"/>
+          <w:szCs w:val="28"/>
+        </w:rPr>
+        <w:t>KVstore</w:t>
+      </w:r>
+      <w:proofErr w:type="spellEnd"/>
+      <w:r>
+        <w:rPr>
+          <w:sz w:val="28"/>
+          <w:szCs w:val="28"/>
+        </w:rPr>
+        <w:t xml:space="preserve">- </w:t>
+      </w:r>
+      <w:r>
+        <w:rPr>
+          <w:sz w:val="28"/>
+          <w:szCs w:val="28"/>
+        </w:rPr>
+        <w:t xml:space="preserve">has a </w:t>
+      </w:r>
+      <w:proofErr w:type="spellStart"/>
+      <w:r>
+        <w:rPr>
+          <w:sz w:val="28"/>
+          <w:szCs w:val="28"/>
+        </w:rPr>
+        <w:t>hashmap</w:t>
+      </w:r>
+      <w:proofErr w:type="spellEnd"/>
+      <w:r>
+        <w:rPr>
+          <w:sz w:val="28"/>
+          <w:szCs w:val="28"/>
+        </w:rPr>
+        <w:t xml:space="preserve"> and the get set and delete functions. Calls the </w:t>
+      </w:r>
+      <w:proofErr w:type="spellStart"/>
+      <w:r>
+        <w:rPr>
+          <w:sz w:val="28"/>
+          <w:szCs w:val="28"/>
+        </w:rPr>
+        <w:t>walwriter</w:t>
+      </w:r>
+      <w:proofErr w:type="spellEnd"/>
+      <w:r>
+        <w:rPr>
+          <w:sz w:val="28"/>
+          <w:szCs w:val="28"/>
+        </w:rPr>
+        <w:t xml:space="preserve"> object and </w:t>
+      </w:r>
+      <w:proofErr w:type="spellStart"/>
+      <w:r>
+        <w:rPr>
+          <w:sz w:val="28"/>
+          <w:szCs w:val="28"/>
+        </w:rPr>
+        <w:t>perfeorms</w:t>
+      </w:r>
+      <w:proofErr w:type="spellEnd"/>
+      <w:r>
+        <w:rPr>
+          <w:sz w:val="28"/>
+          <w:szCs w:val="28"/>
+        </w:rPr>
+        <w:t xml:space="preserve"> operation non that file too.</w:t>
+      </w:r>
+    </w:p>
+    <w:p>
+      <w:pPr>
+        <w:rPr>
+          <w:sz w:val="28"/>
+          <w:szCs w:val="28"/>
+        </w:rPr>
+      </w:pPr>
+      <w:r>
+        <w:rPr>
+          <w:sz w:val="28"/>
+          <w:szCs w:val="28"/>
+        </w:rPr>
+        <w:t xml:space="preserve">Set </w:t>
+      </w:r>
+      <w:proofErr w:type="spellStart"/>
+      <w:r>
+        <w:rPr>
+          <w:sz w:val="28"/>
+          <w:szCs w:val="28"/>
+        </w:rPr>
+        <w:t>operatioin</w:t>
+      </w:r>
+      <w:proofErr w:type="spellEnd"/>
+      <w:r>
+        <w:rPr>
+          <w:sz w:val="28"/>
+          <w:szCs w:val="28"/>
+        </w:rPr>
+        <w:t xml:space="preserve"> sets the data in the </w:t>
+      </w:r>
+      <w:proofErr w:type="spellStart"/>
+      <w:r>
+        <w:rPr>
+          <w:sz w:val="28"/>
+          <w:szCs w:val="28"/>
+        </w:rPr>
+        <w:t>hashmap</w:t>
+      </w:r>
+      <w:proofErr w:type="spellEnd"/>
+      <w:r>
+        <w:rPr>
+          <w:sz w:val="28"/>
+          <w:szCs w:val="28"/>
+        </w:rPr>
+        <w:t xml:space="preserve"> and appends it to the log file.</w:t>
       </w:r>
       <w:r>
         <w:rPr>
@@ -335,22 +499,30 @@
           <w:sz w:val="28"/>
           <w:szCs w:val="28"/>
         </w:rPr>
-        <w:t>so that 2 clients dont write at the same time and corrupt the data.</w:t>
-      </w:r>
-    </w:p>
-    <w:p>
-      <w:pPr>
-        <w:rPr>
-          <w:sz w:val="28"/>
-          <w:szCs w:val="28"/>
-        </w:rPr>
-      </w:pPr>
-      <w:r>
-        <w:rPr>
-          <w:sz w:val="28"/>
-          <w:szCs w:val="28"/>
-        </w:rPr>
-        <w:t>Created the client and the server</w:t>
+        <w:t xml:space="preserve">so that 2 clients </w:t>
+      </w:r>
+      <w:proofErr w:type="spellStart"/>
+      <w:r>
+        <w:rPr>
+          <w:sz w:val="28"/>
+          <w:szCs w:val="28"/>
+        </w:rPr>
+        <w:t>dont</w:t>
+      </w:r>
+      <w:proofErr w:type="spellEnd"/>
+      <w:r>
+        <w:rPr>
+          <w:sz w:val="28"/>
+          <w:szCs w:val="28"/>
+        </w:rPr>
+        <w:t xml:space="preserve"> write at the same time and corrupt the data.</w:t>
+      </w:r>
+      <w:r>
+        <w:rPr>
+          <w:sz w:val="28"/>
+          <w:szCs w:val="28"/>
+        </w:rPr>
+        <w:t xml:space="preserve"> </w:t>
       </w:r>
     </w:p>
     <w:p>
@@ -366,30 +538,55 @@
           <w:szCs w:val="28"/>
         </w:rPr>
         <w:lastRenderedPageBreak/>
-        <w:t xml:space="preserve">Phase 1- </w:t>
-      </w:r>
-      <w:r>
-        <w:rPr>
-          <w:sz w:val="28"/>
-          <w:szCs w:val="28"/>
-        </w:rPr>
-        <w:t>a persistent, concurrent, networked key-value store. Your data now survives crashes and restarts.</w:t>
-      </w:r>
-      <w:r>
-        <w:rPr>
-          <w:sz w:val="28"/>
-          <w:szCs w:val="28"/>
-        </w:rPr>
-        <w:t xml:space="preserve"> - done</w:t>
-      </w:r>
-    </w:p>
-    <w:p>
-      <w:pPr>
-        <w:rPr>
-          <w:sz w:val="28"/>
-          <w:szCs w:val="28"/>
-        </w:rPr>
-      </w:pPr>
+        <w:t>Phase 2 - replication</w:t>
+      </w:r>
+    </w:p>
+    <w:p>
+      <w:r>
+        <w:t>making your data exist on multiple servers at the same time so it doesn't disappear if one server crashes.</w:t>
+      </w:r>
+    </w:p>
+    <w:p>
+      <w:r>
+        <w:t>Client -&gt; leader -&gt; (follower1, follower</w:t>
+      </w:r>
+      <w:proofErr w:type="gramStart"/>
+      <w:r>
+        <w:t>2 ,</w:t>
+      </w:r>
+      <w:proofErr w:type="gramEnd"/>
+      <w:r>
+        <w:t xml:space="preserve"> follower3)</w:t>
+      </w:r>
+    </w:p>
+    <w:p>
+      <w:r>
+        <w:t>Adding roles to servers</w:t>
+      </w:r>
+      <w:r>
+        <w:t xml:space="preserve"> to know if its leader or follower.</w:t>
+      </w:r>
+    </w:p>
+    <w:p>
+      <w:r>
+        <w:t>Leader fans out to the followers.</w:t>
+      </w:r>
+    </w:p>
+    <w:p>
+      <w:r>
+        <w:t>To keep the data consistent – make only the leader write follower cannot set data</w:t>
+      </w:r>
+    </w:p>
+    <w:p>
+      <w:pPr>
+        <w:rPr>
+          <w:sz w:val="28"/>
+          <w:szCs w:val="28"/>
+        </w:rPr>
+      </w:pPr>
+      <w:r>
+        <w:t>Heartbeats and failure detection – the leaders pings the follower every second and logs if the follower doesn’t reposnd</w:t>
+      </w:r>
     </w:p>
     <w:p>
       <w:pPr>

</xml_diff>

<commit_message>
Phase 2 - Complete
</commit_message>
<xml_diff>
--- a/Explanation.docx
+++ b/Explanation.docx
@@ -19,146 +19,55 @@
           <w:sz w:val="32"/>
           <w:szCs w:val="32"/>
         </w:rPr>
-        <w:t>D</w:t>
-      </w:r>
-      <w:r>
-        <w:rPr>
-          <w:b/>
-          <w:bCs/>
-          <w:sz w:val="32"/>
-          <w:szCs w:val="32"/>
-        </w:rPr>
-        <w:t>istributed key-value store</w:t>
-      </w:r>
-    </w:p>
-    <w:p>
-      <w:pPr>
-        <w:rPr>
-          <w:sz w:val="28"/>
-          <w:szCs w:val="28"/>
-        </w:rPr>
-      </w:pPr>
-      <w:r>
-        <w:rPr>
-          <w:sz w:val="28"/>
-          <w:szCs w:val="28"/>
-        </w:rPr>
+        <w:t>Distributed key-value store</w:t>
+      </w:r>
+    </w:p>
+    <w:p>
+      <w:r>
         <w:t>A storage system in the form of key value pair which is distributed across many servers.</w:t>
       </w:r>
     </w:p>
     <w:p>
-      <w:pPr>
-        <w:rPr>
-          <w:sz w:val="28"/>
-          <w:szCs w:val="28"/>
-        </w:rPr>
-      </w:pPr>
-      <w:r>
-        <w:rPr>
-          <w:sz w:val="28"/>
-          <w:szCs w:val="28"/>
-        </w:rPr>
-        <w:t xml:space="preserve">Phase 1- </w:t>
-      </w:r>
-      <w:r>
-        <w:rPr>
-          <w:sz w:val="28"/>
-          <w:szCs w:val="28"/>
-        </w:rPr>
-        <w:t>a persistent, concurrent, networked key-value store. Your data now survives crashes and restarts.</w:t>
-      </w:r>
-      <w:r>
-        <w:rPr>
-          <w:sz w:val="28"/>
-          <w:szCs w:val="28"/>
-        </w:rPr>
-        <w:t xml:space="preserve"> - done</w:t>
-      </w:r>
-    </w:p>
-    <w:p>
-      <w:pPr>
-        <w:rPr>
-          <w:sz w:val="28"/>
-          <w:szCs w:val="28"/>
-        </w:rPr>
-      </w:pPr>
-      <w:r>
-        <w:rPr>
-          <w:sz w:val="28"/>
-          <w:szCs w:val="28"/>
-        </w:rPr>
+      <w:r>
+        <w:t>Phase 1- a persistent, concurrent, networked key-value store. Your data now survives crashes and restarts. - done</w:t>
+      </w:r>
+    </w:p>
+    <w:p>
+      <w:r>
         <w:t xml:space="preserve">Step 1 – create a </w:t>
       </w:r>
       <w:proofErr w:type="spellStart"/>
       <w:r>
-        <w:rPr>
-          <w:sz w:val="28"/>
-          <w:szCs w:val="28"/>
-        </w:rPr>
         <w:t>dictonary</w:t>
       </w:r>
       <w:proofErr w:type="spellEnd"/>
       <w:r>
-        <w:rPr>
-          <w:sz w:val="28"/>
-          <w:szCs w:val="28"/>
-        </w:rPr>
         <w:t xml:space="preserve"> that sits on a server.</w:t>
       </w:r>
     </w:p>
     <w:p>
-      <w:pPr>
-        <w:rPr>
-          <w:sz w:val="28"/>
-          <w:szCs w:val="28"/>
-        </w:rPr>
-      </w:pPr>
       <w:r>
         <w:rPr>
           <w:i/>
           <w:iCs/>
-          <w:sz w:val="28"/>
-          <w:szCs w:val="28"/>
         </w:rPr>
         <w:t>Server</w:t>
       </w:r>
       <w:r>
-        <w:rPr>
-          <w:sz w:val="28"/>
-          <w:szCs w:val="28"/>
-        </w:rPr>
         <w:t>- that opens a port and lets a user connect to a port.</w:t>
       </w:r>
     </w:p>
     <w:p>
-      <w:pPr>
-        <w:rPr>
-          <w:sz w:val="28"/>
-          <w:szCs w:val="28"/>
-        </w:rPr>
-      </w:pPr>
-      <w:r>
-        <w:rPr>
-          <w:sz w:val="28"/>
-          <w:szCs w:val="28"/>
-        </w:rPr>
+      <w:r>
         <w:t>When a new connection arrives – a thread is created to handle the connection, and the server can continue accepting other connections.</w:t>
       </w:r>
     </w:p>
     <w:p>
-      <w:pPr>
-        <w:rPr>
-          <w:sz w:val="28"/>
-          <w:szCs w:val="28"/>
-        </w:rPr>
-      </w:pPr>
       <w:proofErr w:type="spellStart"/>
       <w:r>
         <w:rPr>
           <w:i/>
           <w:iCs/>
-          <w:sz w:val="28"/>
-          <w:szCs w:val="28"/>
         </w:rPr>
         <w:t>CommandHandler</w:t>
       </w:r>
@@ -167,66 +76,36 @@
         <w:rPr>
           <w:i/>
           <w:iCs/>
-          <w:sz w:val="28"/>
-          <w:szCs w:val="28"/>
         </w:rPr>
         <w:t xml:space="preserve"> </w:t>
       </w:r>
       <w:proofErr w:type="gramStart"/>
       <w:r>
-        <w:rPr>
-          <w:sz w:val="28"/>
-          <w:szCs w:val="28"/>
-        </w:rPr>
         <w:t>-  it’s</w:t>
       </w:r>
       <w:proofErr w:type="gramEnd"/>
       <w:r>
-        <w:rPr>
-          <w:sz w:val="28"/>
-          <w:szCs w:val="28"/>
-        </w:rPr>
         <w:t xml:space="preserve"> used to translate the commands it gets (SET/GET/DEL) and perform the right operation.</w:t>
       </w:r>
     </w:p>
     <w:p>
-      <w:pPr>
-        <w:rPr>
-          <w:sz w:val="28"/>
-          <w:szCs w:val="28"/>
-        </w:rPr>
-      </w:pPr>
       <w:r>
         <w:rPr>
           <w:i/>
           <w:iCs/>
-          <w:sz w:val="28"/>
-          <w:szCs w:val="28"/>
         </w:rPr>
         <w:t>Store</w:t>
       </w:r>
       <w:r>
-        <w:rPr>
-          <w:sz w:val="28"/>
-          <w:szCs w:val="28"/>
-        </w:rPr>
         <w:t>- which is the actual dictionary storage. Using HashMap. ReadWriteLock to make sure it doesn’t write at the same time.</w:t>
       </w:r>
     </w:p>
     <w:p>
-      <w:pPr>
-        <w:rPr>
-          <w:sz w:val="28"/>
-          <w:szCs w:val="28"/>
-        </w:rPr>
-      </w:pPr>
       <w:proofErr w:type="spellStart"/>
       <w:r>
         <w:rPr>
           <w:i/>
           <w:iCs/>
-          <w:sz w:val="28"/>
-          <w:szCs w:val="28"/>
         </w:rPr>
         <w:t>Walwriter</w:t>
       </w:r>
@@ -235,374 +114,685 @@
         <w:rPr>
           <w:i/>
           <w:iCs/>
-          <w:sz w:val="28"/>
-          <w:szCs w:val="28"/>
         </w:rPr>
         <w:t xml:space="preserve"> </w:t>
       </w:r>
       <w:r>
-        <w:rPr>
-          <w:sz w:val="28"/>
-          <w:szCs w:val="28"/>
-        </w:rPr>
         <w:t>– safety log that writes everything to a log and if anything crashes then it reads this file and replays every command to retore the data.</w:t>
       </w:r>
     </w:p>
     <w:p>
-      <w:pPr>
-        <w:rPr>
-          <w:sz w:val="28"/>
-          <w:szCs w:val="28"/>
-        </w:rPr>
-      </w:pPr>
-      <w:r>
-        <w:rPr>
-          <w:sz w:val="28"/>
-          <w:szCs w:val="28"/>
-        </w:rPr>
+      <w:r>
         <w:t>Setting up everything.</w:t>
       </w:r>
     </w:p>
     <w:p>
-      <w:pPr>
-        <w:rPr>
-          <w:sz w:val="28"/>
-          <w:szCs w:val="28"/>
-        </w:rPr>
-      </w:pPr>
-      <w:r>
-        <w:rPr>
-          <w:sz w:val="28"/>
-          <w:szCs w:val="28"/>
-        </w:rPr>
+      <w:r>
         <w:t>Till now completed-</w:t>
       </w:r>
     </w:p>
     <w:p>
-      <w:pPr>
-        <w:rPr>
-          <w:sz w:val="28"/>
-          <w:szCs w:val="28"/>
-        </w:rPr>
-      </w:pPr>
-      <w:r>
-        <w:rPr>
-          <w:sz w:val="28"/>
-          <w:szCs w:val="28"/>
-        </w:rPr>
+      <w:r>
         <w:t xml:space="preserve">Built the </w:t>
       </w:r>
       <w:proofErr w:type="spellStart"/>
       <w:r>
-        <w:rPr>
-          <w:sz w:val="28"/>
-          <w:szCs w:val="28"/>
-        </w:rPr>
         <w:t>key:value</w:t>
       </w:r>
       <w:proofErr w:type="spellEnd"/>
       <w:r>
-        <w:rPr>
-          <w:sz w:val="28"/>
-          <w:szCs w:val="28"/>
-        </w:rPr>
         <w:t xml:space="preserve"> storage.</w:t>
       </w:r>
       <w:r>
-        <w:rPr>
-          <w:sz w:val="28"/>
-          <w:szCs w:val="28"/>
-        </w:rPr>
         <w:t>:</w:t>
       </w:r>
     </w:p>
     <w:p>
-      <w:pPr>
-        <w:rPr>
-          <w:sz w:val="28"/>
-          <w:szCs w:val="28"/>
-        </w:rPr>
-      </w:pPr>
-      <w:proofErr w:type="spellStart"/>
-      <w:r>
-        <w:rPr>
-          <w:sz w:val="28"/>
-          <w:szCs w:val="28"/>
-        </w:rPr>
+      <w:proofErr w:type="spellStart"/>
+      <w:r>
         <w:t>KVstore</w:t>
       </w:r>
       <w:proofErr w:type="spellEnd"/>
       <w:r>
-        <w:rPr>
-          <w:sz w:val="28"/>
-          <w:szCs w:val="28"/>
-        </w:rPr>
         <w:t xml:space="preserve">- </w:t>
       </w:r>
       <w:r>
-        <w:rPr>
-          <w:sz w:val="28"/>
-          <w:szCs w:val="28"/>
-        </w:rPr>
         <w:t xml:space="preserve">has a </w:t>
       </w:r>
       <w:proofErr w:type="spellStart"/>
       <w:r>
-        <w:rPr>
-          <w:sz w:val="28"/>
-          <w:szCs w:val="28"/>
-        </w:rPr>
         <w:t>hashmap</w:t>
       </w:r>
       <w:proofErr w:type="spellEnd"/>
       <w:r>
-        <w:rPr>
-          <w:sz w:val="28"/>
-          <w:szCs w:val="28"/>
-        </w:rPr>
         <w:t xml:space="preserve"> and the get set and delete functions. Calls the </w:t>
       </w:r>
       <w:proofErr w:type="spellStart"/>
       <w:r>
-        <w:rPr>
-          <w:sz w:val="28"/>
-          <w:szCs w:val="28"/>
-        </w:rPr>
         <w:t>walwriter</w:t>
       </w:r>
       <w:proofErr w:type="spellEnd"/>
       <w:r>
-        <w:rPr>
-          <w:sz w:val="28"/>
-          <w:szCs w:val="28"/>
-        </w:rPr>
         <w:t xml:space="preserve"> object and </w:t>
       </w:r>
       <w:proofErr w:type="spellStart"/>
       <w:r>
-        <w:rPr>
-          <w:sz w:val="28"/>
-          <w:szCs w:val="28"/>
-        </w:rPr>
         <w:t>perfeorms</w:t>
       </w:r>
       <w:proofErr w:type="spellEnd"/>
       <w:r>
-        <w:rPr>
-          <w:sz w:val="28"/>
-          <w:szCs w:val="28"/>
-        </w:rPr>
         <w:t xml:space="preserve"> operation non that file too.</w:t>
       </w:r>
     </w:p>
     <w:p>
-      <w:pPr>
-        <w:rPr>
-          <w:sz w:val="28"/>
-          <w:szCs w:val="28"/>
-        </w:rPr>
-      </w:pPr>
-      <w:r>
-        <w:rPr>
-          <w:sz w:val="28"/>
-          <w:szCs w:val="28"/>
-        </w:rPr>
+      <w:r>
         <w:t xml:space="preserve">Set </w:t>
       </w:r>
       <w:proofErr w:type="spellStart"/>
       <w:r>
-        <w:rPr>
-          <w:sz w:val="28"/>
-          <w:szCs w:val="28"/>
-        </w:rPr>
         <w:t>operatioin</w:t>
       </w:r>
       <w:proofErr w:type="spellEnd"/>
       <w:r>
-        <w:rPr>
-          <w:sz w:val="28"/>
-          <w:szCs w:val="28"/>
-        </w:rPr>
         <w:t xml:space="preserve"> sets the data in the </w:t>
       </w:r>
       <w:proofErr w:type="spellStart"/>
       <w:r>
-        <w:rPr>
-          <w:sz w:val="28"/>
-          <w:szCs w:val="28"/>
-        </w:rPr>
         <w:t>hashmap</w:t>
       </w:r>
       <w:proofErr w:type="spellEnd"/>
       <w:r>
-        <w:rPr>
-          <w:sz w:val="28"/>
-          <w:szCs w:val="28"/>
-        </w:rPr>
-        <w:t xml:space="preserve"> and appends it to the log file.</w:t>
-      </w:r>
-      <w:r>
-        <w:rPr>
-          <w:sz w:val="28"/>
-          <w:szCs w:val="28"/>
-        </w:rPr>
+        <w:t xml:space="preserve"> and appends it to the log file. </w:t>
+      </w:r>
+      <w:proofErr w:type="gramStart"/>
+      <w:r>
+        <w:t>Similarly</w:t>
+      </w:r>
+      <w:proofErr w:type="gramEnd"/>
+      <w:r>
+        <w:t xml:space="preserve"> the delete operation</w:t>
+      </w:r>
+    </w:p>
+    <w:p>
+      <w:r>
+        <w:t>The apply command operation applies all the commands in the log file when server crashes.</w:t>
+      </w:r>
+    </w:p>
+    <w:p>
+      <w:r>
+        <w:t xml:space="preserve">Synchronized so that 2 clients </w:t>
+      </w:r>
+      <w:proofErr w:type="spellStart"/>
+      <w:r>
+        <w:t>dont</w:t>
+      </w:r>
+      <w:proofErr w:type="spellEnd"/>
+      <w:r>
+        <w:t xml:space="preserve"> write at the same time and corrupt the data.</w:t>
+      </w:r>
+      <w:r>
         <w:t xml:space="preserve"> </w:t>
       </w:r>
+    </w:p>
+    <w:p>
+      <w:r>
+        <w:t xml:space="preserve">THREAD IS CRESTED SO </w:t>
+      </w:r>
+      <w:proofErr w:type="spellStart"/>
+      <w:r>
+        <w:t>THAt</w:t>
+      </w:r>
+      <w:proofErr w:type="spellEnd"/>
+      <w:r>
+        <w:t xml:space="preserve"> multiple clients can use it at the same time. Each thread assigned to one client.</w:t>
+      </w:r>
+    </w:p>
+    <w:p/>
+    <w:p/>
+    <w:p>
+      <w:pPr>
+        <w:rPr>
+          <w:sz w:val="28"/>
+          <w:szCs w:val="28"/>
+        </w:rPr>
+      </w:pPr>
+      <w:r>
+        <w:rPr>
+          <w:sz w:val="28"/>
+          <w:szCs w:val="28"/>
+        </w:rPr>
+        <w:t>Phase 2 - replication</w:t>
+      </w:r>
+    </w:p>
+    <w:p>
+      <w:r>
+        <w:t>making your data exist on multiple servers at the same time so it doesn't disappear if one server crashes.</w:t>
+      </w:r>
+    </w:p>
+    <w:p>
+      <w:r>
+        <w:t>Client -&gt; leader -&gt; (follower1, follower</w:t>
+      </w:r>
       <w:proofErr w:type="gramStart"/>
       <w:r>
-        <w:rPr>
-          <w:sz w:val="28"/>
-          <w:szCs w:val="28"/>
-        </w:rPr>
-        <w:t>Similarly</w:t>
+        <w:t>2 ,</w:t>
       </w:r>
       <w:proofErr w:type="gramEnd"/>
       <w:r>
-        <w:rPr>
-          <w:sz w:val="28"/>
-          <w:szCs w:val="28"/>
-        </w:rPr>
-        <w:t xml:space="preserve"> the delete operation</w:t>
-      </w:r>
-    </w:p>
-    <w:p>
-      <w:pPr>
-        <w:rPr>
-          <w:sz w:val="28"/>
-          <w:szCs w:val="28"/>
-        </w:rPr>
-      </w:pPr>
-      <w:r>
-        <w:rPr>
-          <w:sz w:val="28"/>
-          <w:szCs w:val="28"/>
-        </w:rPr>
-        <w:t>The apply command operation applies all the commands in the log file when server crashes.</w:t>
-      </w:r>
-    </w:p>
-    <w:p>
-      <w:pPr>
-        <w:rPr>
-          <w:sz w:val="28"/>
-          <w:szCs w:val="28"/>
-        </w:rPr>
-      </w:pPr>
-      <w:r>
-        <w:rPr>
-          <w:sz w:val="28"/>
-          <w:szCs w:val="28"/>
-        </w:rPr>
-        <w:t xml:space="preserve">Synchronized </w:t>
-      </w:r>
-      <w:r>
-        <w:rPr>
-          <w:sz w:val="28"/>
-          <w:szCs w:val="28"/>
-        </w:rPr>
-        <w:t xml:space="preserve">so that 2 clients </w:t>
-      </w:r>
-      <w:proofErr w:type="spellStart"/>
-      <w:r>
-        <w:rPr>
-          <w:sz w:val="28"/>
-          <w:szCs w:val="28"/>
-        </w:rPr>
-        <w:t>dont</w:t>
-      </w:r>
-      <w:proofErr w:type="spellEnd"/>
-      <w:r>
-        <w:rPr>
-          <w:sz w:val="28"/>
-          <w:szCs w:val="28"/>
-        </w:rPr>
-        <w:t xml:space="preserve"> write at the same time and corrupt the data.</w:t>
-      </w:r>
-      <w:r>
-        <w:rPr>
-          <w:sz w:val="28"/>
-          <w:szCs w:val="28"/>
-        </w:rPr>
+        <w:t xml:space="preserve"> follower3)</w:t>
+      </w:r>
+    </w:p>
+    <w:p>
+      <w:pPr>
+        <w:pStyle w:val="ListParagraph"/>
+        <w:numPr>
+          <w:ilvl w:val="0"/>
+          <w:numId w:val="1"/>
+        </w:numPr>
+      </w:pPr>
+      <w:r>
+        <w:t>Adding roles to servers</w:t>
+      </w:r>
+      <w:r>
+        <w:t xml:space="preserve"> to know if its leader or follower.</w:t>
+      </w:r>
+      <w:r>
+        <w:t xml:space="preserve">- this is done using </w:t>
+      </w:r>
+      <w:proofErr w:type="spellStart"/>
+      <w:r>
+        <w:t>enum</w:t>
+      </w:r>
+      <w:proofErr w:type="spellEnd"/>
+      <w:r>
+        <w:t xml:space="preserve">- making it stricter and other names or string </w:t>
+      </w:r>
+      <w:proofErr w:type="spellStart"/>
+      <w:r>
+        <w:t>asre</w:t>
+      </w:r>
+      <w:proofErr w:type="spellEnd"/>
+      <w:r>
+        <w:t xml:space="preserve"> not possible</w:t>
+      </w:r>
+    </w:p>
+    <w:p/>
+    <w:p>
+      <w:pPr>
+        <w:pStyle w:val="ListParagraph"/>
+        <w:numPr>
+          <w:ilvl w:val="0"/>
+          <w:numId w:val="1"/>
+        </w:numPr>
+      </w:pPr>
+      <w:r>
+        <w:t xml:space="preserve">Leader fans out to the </w:t>
+      </w:r>
+      <w:proofErr w:type="gramStart"/>
+      <w:r>
+        <w:t>followers.</w:t>
+      </w:r>
+      <w:r>
+        <w:t>-</w:t>
+      </w:r>
+      <w:proofErr w:type="gramEnd"/>
+      <w:r>
+        <w:t xml:space="preserve"> created the replication client file which consists of list of </w:t>
+      </w:r>
+      <w:proofErr w:type="gramStart"/>
+      <w:r>
+        <w:t>followers .</w:t>
+      </w:r>
+      <w:proofErr w:type="gramEnd"/>
+      <w:r>
+        <w:t xml:space="preserve"> the replicate function creates a connection with the followers and sends the </w:t>
+      </w:r>
+      <w:r>
+        <w:t>command. The</w:t>
+      </w:r>
+      <w:r>
         <w:t xml:space="preserve"> </w:t>
       </w:r>
-    </w:p>
-    <w:p>
-      <w:pPr>
-        <w:rPr>
-          <w:sz w:val="28"/>
-          <w:szCs w:val="28"/>
-        </w:rPr>
-      </w:pPr>
-      <w:r>
-        <w:rPr>
-          <w:sz w:val="28"/>
-          <w:szCs w:val="28"/>
-        </w:rPr>
+      <w:proofErr w:type="spellStart"/>
+      <w:r>
+        <w:t>kvstore</w:t>
+      </w:r>
+      <w:proofErr w:type="spellEnd"/>
+      <w:r>
+        <w:t xml:space="preserve"> storage checks if the replication is not </w:t>
+      </w:r>
+      <w:proofErr w:type="gramStart"/>
+      <w:r>
+        <w:t>null(</w:t>
+      </w:r>
+      <w:proofErr w:type="gramEnd"/>
+      <w:r>
+        <w:t xml:space="preserve">is it is not a follower) it calls the replicate function with </w:t>
+      </w:r>
+      <w:proofErr w:type="gramStart"/>
+      <w:r>
+        <w:t>the  command</w:t>
+      </w:r>
+      <w:proofErr w:type="gramEnd"/>
+      <w:r>
+        <w:t xml:space="preserve">. In the main function the replication client object is created which is initially null (for followers) if the role is leader the followers list is set to the </w:t>
+      </w:r>
+      <w:r>
+        <w:t>replication client</w:t>
+      </w:r>
+      <w:r>
+        <w:t>.</w:t>
+      </w:r>
+    </w:p>
+    <w:p/>
+    <w:p>
+      <w:r>
+        <w:t>To keep the data consistent – make only the leader write follower cannot set data</w:t>
+      </w:r>
+    </w:p>
+    <w:p>
+      <w:pPr>
+        <w:pStyle w:val="ListParagraph"/>
+        <w:numPr>
+          <w:ilvl w:val="0"/>
+          <w:numId w:val="1"/>
+        </w:numPr>
+      </w:pPr>
+      <w:r>
         <w:lastRenderedPageBreak/>
-        <w:t>Phase 2 - replication</w:t>
-      </w:r>
-    </w:p>
-    <w:p>
-      <w:r>
-        <w:t>making your data exist on multiple servers at the same time so it doesn't disappear if one server crashes.</w:t>
-      </w:r>
-    </w:p>
-    <w:p>
-      <w:r>
-        <w:t>Client -&gt; leader -&gt; (follower1, follower</w:t>
+        <w:t xml:space="preserve">Heartbeats and failure detection – the leaders </w:t>
       </w:r>
       <w:proofErr w:type="gramStart"/>
       <w:r>
-        <w:t>2 ,</w:t>
+        <w:t>pings</w:t>
       </w:r>
       <w:proofErr w:type="gramEnd"/>
       <w:r>
-        <w:t xml:space="preserve"> follower3)</w:t>
-      </w:r>
-    </w:p>
-    <w:p>
-      <w:r>
-        <w:t>Adding roles to servers</w:t>
-      </w:r>
-      <w:r>
-        <w:t xml:space="preserve"> to know if its leader or follower.</w:t>
-      </w:r>
-    </w:p>
-    <w:p>
-      <w:r>
-        <w:t>Leader fans out to the followers.</w:t>
-      </w:r>
-    </w:p>
-    <w:p>
-      <w:r>
-        <w:t>To keep the data consistent – make only the leader write follower cannot set data</w:t>
-      </w:r>
-    </w:p>
-    <w:p>
-      <w:pPr>
-        <w:rPr>
-          <w:sz w:val="28"/>
-          <w:szCs w:val="28"/>
-        </w:rPr>
-      </w:pPr>
-      <w:r>
-        <w:t>Heartbeats and failure detection – the leaders pings the follower every second and logs if the follower doesn’t reposnd</w:t>
-      </w:r>
-    </w:p>
-    <w:p>
-      <w:pPr>
-        <w:rPr>
-          <w:sz w:val="28"/>
-          <w:szCs w:val="28"/>
-        </w:rPr>
-      </w:pPr>
-    </w:p>
-    <w:p>
-      <w:pPr>
-        <w:rPr>
-          <w:sz w:val="28"/>
-          <w:szCs w:val="28"/>
-        </w:rPr>
-      </w:pPr>
+        <w:t xml:space="preserve"> the follower every second and logs if the follower doesn’t </w:t>
+      </w:r>
+      <w:proofErr w:type="spellStart"/>
+      <w:r>
+        <w:t>reposnd</w:t>
+      </w:r>
+      <w:proofErr w:type="spellEnd"/>
+      <w:r>
+        <w:t xml:space="preserve">. TO make sure that the follower does not miss the writes when it was </w:t>
+      </w:r>
+      <w:proofErr w:type="gramStart"/>
+      <w:r>
+        <w:t>offline.</w:t>
+      </w:r>
+      <w:r>
+        <w:t>-</w:t>
+      </w:r>
+      <w:proofErr w:type="gramEnd"/>
+      <w:r>
+        <w:t xml:space="preserve"> the scheduler creates another worker or thread</w:t>
+      </w:r>
+      <w:r>
+        <w:t xml:space="preserve">. This worker wakes up every 2 seconds and checks the followers and goes back to </w:t>
+      </w:r>
+      <w:proofErr w:type="spellStart"/>
+      <w:r>
+        <w:t>sleep.</w:t>
+      </w:r>
+      <w:r>
+        <w:t>this</w:t>
+      </w:r>
+      <w:proofErr w:type="spellEnd"/>
+      <w:r>
+        <w:t xml:space="preserve"> scheduler function calls the ping function that creates connection with the followers and if it is alive it will send a Boolean </w:t>
+      </w:r>
+      <w:proofErr w:type="spellStart"/>
+      <w:r>
+        <w:t>reponse.</w:t>
+      </w:r>
+      <w:r>
+        <w:t>The</w:t>
+      </w:r>
+      <w:proofErr w:type="spellEnd"/>
+      <w:r>
+        <w:t xml:space="preserve"> alive map is a </w:t>
+      </w:r>
+      <w:proofErr w:type="spellStart"/>
+      <w:r>
+        <w:t>conncureent</w:t>
+      </w:r>
+      <w:proofErr w:type="spellEnd"/>
+      <w:r>
+        <w:t xml:space="preserve"> </w:t>
+      </w:r>
+      <w:proofErr w:type="spellStart"/>
+      <w:r>
+        <w:t>hasmap</w:t>
+      </w:r>
+      <w:proofErr w:type="spellEnd"/>
+      <w:r>
+        <w:t xml:space="preserve"> and not a regular one because there are two threads that using this map – the scheduler thread and the replicate thread. </w:t>
+      </w:r>
+      <w:r>
+        <w:t>So,</w:t>
+      </w:r>
+      <w:r>
+        <w:t xml:space="preserve"> this </w:t>
+      </w:r>
+      <w:proofErr w:type="spellStart"/>
+      <w:r>
+        <w:t>hashmap</w:t>
+      </w:r>
+      <w:proofErr w:type="spellEnd"/>
+      <w:r>
+        <w:t xml:space="preserve"> handles the concurrency.</w:t>
+      </w:r>
+    </w:p>
+    <w:p>
+      <w:pPr>
+        <w:pStyle w:val="ListParagraph"/>
+        <w:numPr>
+          <w:ilvl w:val="0"/>
+          <w:numId w:val="1"/>
+        </w:numPr>
+      </w:pPr>
+      <w:r>
+        <w:t>Things completed so far:</w:t>
+      </w:r>
+    </w:p>
+    <w:p>
+      <w:pPr>
+        <w:ind w:left="720" w:firstLine="360"/>
+      </w:pPr>
+      <w:r>
+        <w:rPr>
+          <w:rFonts w:hAnsi="Symbol"/>
+        </w:rPr>
+        <w:t></w:t>
+      </w:r>
+      <w:r>
+        <w:t xml:space="preserve"> Multiple</w:t>
+      </w:r>
+      <w:r>
+        <w:t xml:space="preserve"> concurrent clients with threads </w:t>
+      </w:r>
+    </w:p>
+    <w:p>
+      <w:pPr>
+        <w:ind w:left="1080"/>
+      </w:pPr>
+      <w:r>
+        <w:rPr>
+          <w:rFonts w:hAnsi="Symbol"/>
+        </w:rPr>
+        <w:t></w:t>
+      </w:r>
+      <w:r>
+        <w:t xml:space="preserve"> Leader</w:t>
+      </w:r>
+      <w:r>
+        <w:t xml:space="preserve">/follower replication </w:t>
+      </w:r>
+    </w:p>
+    <w:p>
+      <w:pPr>
+        <w:ind w:left="1080"/>
+        <w:rPr>
+          <w:sz w:val="28"/>
+          <w:szCs w:val="28"/>
+        </w:rPr>
+      </w:pPr>
+      <w:r>
+        <w:rPr>
+          <w:rFonts w:hAnsi="Symbol"/>
+        </w:rPr>
+        <w:t></w:t>
+      </w:r>
+      <w:r>
+        <w:t xml:space="preserve"> Fault</w:t>
+      </w:r>
+      <w:r>
+        <w:t xml:space="preserve"> tolerance (leader keeps running when follower dies)</w:t>
+      </w:r>
+    </w:p>
+    <w:p>
+      <w:pPr>
+        <w:rPr>
+          <w:sz w:val="28"/>
+          <w:szCs w:val="28"/>
+        </w:rPr>
+      </w:pPr>
+      <w:r>
+        <w:rPr>
+          <w:sz w:val="28"/>
+          <w:szCs w:val="28"/>
+        </w:rPr>
+        <w:t>How to run:</w:t>
+      </w:r>
+    </w:p>
+    <w:p>
+      <w:pPr>
+        <w:rPr>
+          <w:sz w:val="28"/>
+          <w:szCs w:val="28"/>
+        </w:rPr>
+      </w:pPr>
+      <w:r>
+        <w:rPr>
+          <w:sz w:val="28"/>
+          <w:szCs w:val="28"/>
+        </w:rPr>
+        <w:t xml:space="preserve">To </w:t>
+      </w:r>
+      <w:proofErr w:type="spellStart"/>
+      <w:r>
+        <w:rPr>
+          <w:sz w:val="28"/>
+          <w:szCs w:val="28"/>
+        </w:rPr>
+        <w:t>complie</w:t>
+      </w:r>
+      <w:proofErr w:type="spellEnd"/>
+      <w:r>
+        <w:rPr>
+          <w:sz w:val="28"/>
+          <w:szCs w:val="28"/>
+        </w:rPr>
+        <w:t xml:space="preserve">- </w:t>
+      </w:r>
+      <w:proofErr w:type="spellStart"/>
+      <w:r>
+        <w:rPr>
+          <w:sz w:val="28"/>
+          <w:szCs w:val="28"/>
+        </w:rPr>
+        <w:t>javac</w:t>
+      </w:r>
+      <w:proofErr w:type="spellEnd"/>
+      <w:r>
+        <w:rPr>
+          <w:sz w:val="28"/>
+          <w:szCs w:val="28"/>
+        </w:rPr>
+        <w:t xml:space="preserve"> -d out </w:t>
+      </w:r>
+      <w:proofErr w:type="spellStart"/>
+      <w:r>
+        <w:rPr>
+          <w:sz w:val="28"/>
+          <w:szCs w:val="28"/>
+        </w:rPr>
+        <w:t>src</w:t>
+      </w:r>
+      <w:proofErr w:type="spellEnd"/>
+      <w:r>
+        <w:rPr>
+          <w:sz w:val="28"/>
+          <w:szCs w:val="28"/>
+        </w:rPr>
+        <w:t>/</w:t>
+      </w:r>
+      <w:proofErr w:type="spellStart"/>
+      <w:r>
+        <w:rPr>
+          <w:sz w:val="28"/>
+          <w:szCs w:val="28"/>
+        </w:rPr>
+        <w:t>kvstore</w:t>
+      </w:r>
+      <w:proofErr w:type="spellEnd"/>
+      <w:r>
+        <w:rPr>
+          <w:sz w:val="28"/>
+          <w:szCs w:val="28"/>
+        </w:rPr>
+        <w:t>/*.java</w:t>
+      </w:r>
+    </w:p>
+    <w:p>
+      <w:pPr>
+        <w:rPr>
+          <w:sz w:val="28"/>
+          <w:szCs w:val="28"/>
+        </w:rPr>
+      </w:pPr>
+      <w:r>
+        <w:rPr>
+          <w:sz w:val="28"/>
+          <w:szCs w:val="28"/>
+        </w:rPr>
+        <w:t xml:space="preserve">To create the leader - </w:t>
+      </w:r>
+      <w:r>
+        <w:rPr>
+          <w:sz w:val="28"/>
+          <w:szCs w:val="28"/>
+        </w:rPr>
+        <w:t xml:space="preserve">java -cp out </w:t>
+      </w:r>
+      <w:proofErr w:type="spellStart"/>
+      <w:proofErr w:type="gramStart"/>
+      <w:r>
+        <w:rPr>
+          <w:sz w:val="28"/>
+          <w:szCs w:val="28"/>
+        </w:rPr>
+        <w:t>kvstore.Main</w:t>
+      </w:r>
+      <w:proofErr w:type="spellEnd"/>
+      <w:proofErr w:type="gramEnd"/>
+      <w:r>
+        <w:rPr>
+          <w:sz w:val="28"/>
+          <w:szCs w:val="28"/>
+        </w:rPr>
+        <w:t xml:space="preserve"> leader 6379</w:t>
+      </w:r>
+    </w:p>
+    <w:p>
+      <w:pPr>
+        <w:rPr>
+          <w:sz w:val="28"/>
+          <w:szCs w:val="28"/>
+        </w:rPr>
+      </w:pPr>
+      <w:r>
+        <w:rPr>
+          <w:sz w:val="28"/>
+          <w:szCs w:val="28"/>
+        </w:rPr>
+        <w:t>T</w:t>
+      </w:r>
+      <w:r>
+        <w:rPr>
+          <w:sz w:val="28"/>
+          <w:szCs w:val="28"/>
+        </w:rPr>
+        <w:t>o</w:t>
+      </w:r>
+      <w:r>
+        <w:rPr>
+          <w:sz w:val="28"/>
+          <w:szCs w:val="28"/>
+        </w:rPr>
+        <w:t xml:space="preserve"> create the follower - </w:t>
+      </w:r>
+      <w:r>
+        <w:rPr>
+          <w:sz w:val="28"/>
+          <w:szCs w:val="28"/>
+        </w:rPr>
+        <w:t xml:space="preserve">java -cp out </w:t>
+      </w:r>
+      <w:proofErr w:type="spellStart"/>
+      <w:proofErr w:type="gramStart"/>
+      <w:r>
+        <w:rPr>
+          <w:sz w:val="28"/>
+          <w:szCs w:val="28"/>
+        </w:rPr>
+        <w:t>kvstore.Main</w:t>
+      </w:r>
+      <w:proofErr w:type="spellEnd"/>
+      <w:proofErr w:type="gramEnd"/>
+      <w:r>
+        <w:rPr>
+          <w:sz w:val="28"/>
+          <w:szCs w:val="28"/>
+        </w:rPr>
+        <w:t xml:space="preserve"> follower 6380</w:t>
+      </w:r>
+    </w:p>
+    <w:p>
+      <w:pPr>
+        <w:rPr>
+          <w:sz w:val="28"/>
+          <w:szCs w:val="28"/>
+        </w:rPr>
+      </w:pPr>
+      <w:r>
+        <w:rPr>
+          <w:sz w:val="28"/>
+          <w:szCs w:val="28"/>
+        </w:rPr>
+        <w:t xml:space="preserve">To connect to a host as a client - </w:t>
+      </w:r>
+      <w:proofErr w:type="spellStart"/>
+      <w:r>
+        <w:rPr>
+          <w:sz w:val="28"/>
+          <w:szCs w:val="28"/>
+        </w:rPr>
+        <w:t>nc</w:t>
+      </w:r>
+      <w:proofErr w:type="spellEnd"/>
+      <w:r>
+        <w:rPr>
+          <w:sz w:val="28"/>
+          <w:szCs w:val="28"/>
+        </w:rPr>
+        <w:t xml:space="preserve"> localhost </w:t>
+      </w:r>
+      <w:r>
+        <w:rPr>
+          <w:sz w:val="28"/>
+          <w:szCs w:val="28"/>
+        </w:rPr>
+        <w:t>“</w:t>
+      </w:r>
+      <w:proofErr w:type="spellStart"/>
+      <w:r>
+        <w:rPr>
+          <w:sz w:val="28"/>
+          <w:szCs w:val="28"/>
+        </w:rPr>
+        <w:t>portno</w:t>
+      </w:r>
+      <w:proofErr w:type="spellEnd"/>
+      <w:r>
+        <w:rPr>
+          <w:sz w:val="28"/>
+          <w:szCs w:val="28"/>
+        </w:rPr>
+        <w:t>”</w:t>
+      </w:r>
     </w:p>
     <w:sectPr>
       <w:pgSz w:w="12240" w:h="15840"/>
@@ -612,6 +802,103 @@
     </w:sectPr>
   </w:body>
 </w:document>
+</file>
+
+<file path=word/numbering.xml><?xml version="1.0" encoding="utf-8"?>
+<w:numbering xmlns:wpc="http://schemas.microsoft.com/office/word/2010/wordprocessingCanvas" xmlns:cx="http://schemas.microsoft.com/office/drawing/2014/chartex" xmlns:cx1="http://schemas.microsoft.com/office/drawing/2015/9/8/chartex" xmlns:cx2="http://schemas.microsoft.com/office/drawing/2015/10/21/chartex" xmlns:cx3="http://schemas.microsoft.com/office/drawing/2016/5/9/chartex" xmlns:cx4="http://schemas.microsoft.com/office/drawing/2016/5/10/chartex" xmlns:cx5="http://schemas.microsoft.com/office/drawing/2016/5/11/chartex" xmlns:cx6="http://schemas.microsoft.com/office/drawing/2016/5/12/chartex" xmlns:cx7="http://schemas.microsoft.com/office/drawing/2016/5/13/chartex" xmlns:cx8="http://schemas.microsoft.com/office/drawing/2016/5/14/chartex" xmlns:mc="http://schemas.openxmlformats.org/markup-compatibility/2006" xmlns:aink="http://schemas.microsoft.com/office/drawing/2016/ink" xmlns:am3d="http://schemas.microsoft.com/office/drawing/2017/model3d" xmlns:o="urn:schemas-microsoft-com:office:office" xmlns:oel="http://schemas.microsoft.com/office/2019/extlst" xmlns:r="http://schemas.openxmlformats.org/officeDocument/2006/relationships" xmlns:m="http://schemas.openxmlformats.org/officeDocument/2006/math" xmlns:v="urn:schemas-microsoft-com:vml" xmlns:wp14="http://schemas.microsoft.com/office/word/2010/wordprocessingDrawing" xmlns:wp="http://schemas.openxmlformats.org/drawingml/2006/wordprocessingDrawing" xmlns:w10="urn:schemas-microsoft-com:office:word" xmlns:w="http://schemas.openxmlformats.org/wordprocessingml/2006/main" xmlns:w14="http://schemas.microsoft.com/office/word/2010/wordml" xmlns:w15="http://schemas.microsoft.com/office/word/2012/wordml" xmlns:w16cex="http://schemas.microsoft.com/office/word/2018/wordml/cex" xmlns:w16cid="http://schemas.microsoft.com/office/word/2016/wordml/cid" xmlns:w16="http://schemas.microsoft.com/office/word/2018/wordml" xmlns:w16du="http://schemas.microsoft.com/office/word/2023/wordml/word16du" xmlns:w16sdtdh="http://schemas.microsoft.com/office/word/2020/wordml/sdtdatahash" xmlns:w16sdtfl="http://schemas.microsoft.com/office/word/2024/wordml/sdtformatlock" xmlns:w16se="http://schemas.microsoft.com/office/word/2015/wordml/symex" xmlns:wpg="http://schemas.microsoft.com/office/word/2010/wordprocessingGroup" xmlns:wpi="http://schemas.microsoft.com/office/word/2010/wordprocessingInk" xmlns:wne="http://schemas.microsoft.com/office/word/2006/wordml" xmlns:wps="http://schemas.microsoft.com/office/word/2010/wordprocessingShape" mc:Ignorable="w14 w15 w16se w16cid w16 w16cex w16sdtdh w16sdtfl w16du wp14">
+  <w:abstractNum w:abstractNumId="0" w15:restartNumberingAfterBreak="0">
+    <w:nsid w:val="300330FE"/>
+    <w:multiLevelType w:val="hybridMultilevel"/>
+    <w:tmpl w:val="86A01498"/>
+    <w:lvl w:ilvl="0" w:tplc="04090011">
+      <w:start w:val="1"/>
+      <w:numFmt w:val="decimal"/>
+      <w:lvlText w:val="%1)"/>
+      <w:lvlJc w:val="left"/>
+      <w:pPr>
+        <w:ind w:left="720" w:hanging="360"/>
+      </w:pPr>
+      <w:rPr>
+        <w:rFonts w:hint="default"/>
+      </w:rPr>
+    </w:lvl>
+    <w:lvl w:ilvl="1" w:tplc="04090019" w:tentative="1">
+      <w:start w:val="1"/>
+      <w:numFmt w:val="lowerLetter"/>
+      <w:lvlText w:val="%2."/>
+      <w:lvlJc w:val="left"/>
+      <w:pPr>
+        <w:ind w:left="1440" w:hanging="360"/>
+      </w:pPr>
+    </w:lvl>
+    <w:lvl w:ilvl="2" w:tplc="0409001B" w:tentative="1">
+      <w:start w:val="1"/>
+      <w:numFmt w:val="lowerRoman"/>
+      <w:lvlText w:val="%3."/>
+      <w:lvlJc w:val="right"/>
+      <w:pPr>
+        <w:ind w:left="2160" w:hanging="180"/>
+      </w:pPr>
+    </w:lvl>
+    <w:lvl w:ilvl="3" w:tplc="0409000F" w:tentative="1">
+      <w:start w:val="1"/>
+      <w:numFmt w:val="decimal"/>
+      <w:lvlText w:val="%4."/>
+      <w:lvlJc w:val="left"/>
+      <w:pPr>
+        <w:ind w:left="2880" w:hanging="360"/>
+      </w:pPr>
+    </w:lvl>
+    <w:lvl w:ilvl="4" w:tplc="04090019" w:tentative="1">
+      <w:start w:val="1"/>
+      <w:numFmt w:val="lowerLetter"/>
+      <w:lvlText w:val="%5."/>
+      <w:lvlJc w:val="left"/>
+      <w:pPr>
+        <w:ind w:left="3600" w:hanging="360"/>
+      </w:pPr>
+    </w:lvl>
+    <w:lvl w:ilvl="5" w:tplc="0409001B" w:tentative="1">
+      <w:start w:val="1"/>
+      <w:numFmt w:val="lowerRoman"/>
+      <w:lvlText w:val="%6."/>
+      <w:lvlJc w:val="right"/>
+      <w:pPr>
+        <w:ind w:left="4320" w:hanging="180"/>
+      </w:pPr>
+    </w:lvl>
+    <w:lvl w:ilvl="6" w:tplc="0409000F" w:tentative="1">
+      <w:start w:val="1"/>
+      <w:numFmt w:val="decimal"/>
+      <w:lvlText w:val="%7."/>
+      <w:lvlJc w:val="left"/>
+      <w:pPr>
+        <w:ind w:left="5040" w:hanging="360"/>
+      </w:pPr>
+    </w:lvl>
+    <w:lvl w:ilvl="7" w:tplc="04090019" w:tentative="1">
+      <w:start w:val="1"/>
+      <w:numFmt w:val="lowerLetter"/>
+      <w:lvlText w:val="%8."/>
+      <w:lvlJc w:val="left"/>
+      <w:pPr>
+        <w:ind w:left="5760" w:hanging="360"/>
+      </w:pPr>
+    </w:lvl>
+    <w:lvl w:ilvl="8" w:tplc="0409001B" w:tentative="1">
+      <w:start w:val="1"/>
+      <w:numFmt w:val="lowerRoman"/>
+      <w:lvlText w:val="%9."/>
+      <w:lvlJc w:val="right"/>
+      <w:pPr>
+        <w:ind w:left="6480" w:hanging="180"/>
+      </w:pPr>
+    </w:lvl>
+  </w:abstractNum>
+  <w:num w:numId="1" w16cid:durableId="962076505">
+    <w:abstractNumId w:val="0"/>
+  </w:num>
+</w:numbering>
 </file>
 
 <file path=word/styles.xml><?xml version="1.0" encoding="utf-8"?>
@@ -1014,6 +1301,15 @@
   <w:style w:type="paragraph" w:default="1" w:styleId="Normal">
     <w:name w:val="Normal"/>
     <w:qFormat/>
+    <w:rsid w:val="004C6820"/>
+    <w:pPr>
+      <w:spacing w:after="0" w:line="240" w:lineRule="auto"/>
+    </w:pPr>
+    <w:rPr>
+      <w:rFonts w:ascii="Times New Roman" w:eastAsia="Times New Roman" w:hAnsi="Times New Roman" w:cs="Times New Roman"/>
+      <w:kern w:val="0"/>
+      <w14:ligatures w14:val="none"/>
+    </w:rPr>
   </w:style>
   <w:style w:type="paragraph" w:styleId="Heading1">
     <w:name w:val="heading 1"/>
@@ -1026,14 +1322,16 @@
     <w:pPr>
       <w:keepNext/>
       <w:keepLines/>
-      <w:spacing w:before="360" w:after="80"/>
+      <w:spacing w:before="360" w:after="80" w:line="278" w:lineRule="auto"/>
       <w:outlineLvl w:val="0"/>
     </w:pPr>
     <w:rPr>
       <w:rFonts w:asciiTheme="majorHAnsi" w:eastAsiaTheme="majorEastAsia" w:hAnsiTheme="majorHAnsi" w:cstheme="majorBidi"/>
       <w:color w:val="0F4761" w:themeColor="accent1" w:themeShade="BF"/>
+      <w:kern w:val="2"/>
       <w:sz w:val="40"/>
       <w:szCs w:val="40"/>
+      <w14:ligatures w14:val="standardContextual"/>
     </w:rPr>
   </w:style>
   <w:style w:type="paragraph" w:styleId="Heading2">
@@ -1049,14 +1347,16 @@
     <w:pPr>
       <w:keepNext/>
       <w:keepLines/>
-      <w:spacing w:before="160" w:after="80"/>
+      <w:spacing w:before="160" w:after="80" w:line="278" w:lineRule="auto"/>
       <w:outlineLvl w:val="1"/>
     </w:pPr>
     <w:rPr>
       <w:rFonts w:asciiTheme="majorHAnsi" w:eastAsiaTheme="majorEastAsia" w:hAnsiTheme="majorHAnsi" w:cstheme="majorBidi"/>
       <w:color w:val="0F4761" w:themeColor="accent1" w:themeShade="BF"/>
+      <w:kern w:val="2"/>
       <w:sz w:val="32"/>
       <w:szCs w:val="32"/>
+      <w14:ligatures w14:val="standardContextual"/>
     </w:rPr>
   </w:style>
   <w:style w:type="paragraph" w:styleId="Heading3">
@@ -1072,14 +1372,16 @@
     <w:pPr>
       <w:keepNext/>
       <w:keepLines/>
-      <w:spacing w:before="160" w:after="80"/>
+      <w:spacing w:before="160" w:after="80" w:line="278" w:lineRule="auto"/>
       <w:outlineLvl w:val="2"/>
     </w:pPr>
     <w:rPr>
-      <w:rFonts w:eastAsiaTheme="majorEastAsia" w:cstheme="majorBidi"/>
+      <w:rFonts w:asciiTheme="minorHAnsi" w:eastAsiaTheme="majorEastAsia" w:hAnsiTheme="minorHAnsi" w:cstheme="majorBidi"/>
       <w:color w:val="0F4761" w:themeColor="accent1" w:themeShade="BF"/>
+      <w:kern w:val="2"/>
       <w:sz w:val="28"/>
       <w:szCs w:val="28"/>
+      <w14:ligatures w14:val="standardContextual"/>
     </w:rPr>
   </w:style>
   <w:style w:type="paragraph" w:styleId="Heading4">
@@ -1095,14 +1397,16 @@
     <w:pPr>
       <w:keepNext/>
       <w:keepLines/>
-      <w:spacing w:before="80" w:after="40"/>
+      <w:spacing w:before="80" w:after="40" w:line="278" w:lineRule="auto"/>
       <w:outlineLvl w:val="3"/>
     </w:pPr>
     <w:rPr>
-      <w:rFonts w:eastAsiaTheme="majorEastAsia" w:cstheme="majorBidi"/>
+      <w:rFonts w:asciiTheme="minorHAnsi" w:eastAsiaTheme="majorEastAsia" w:hAnsiTheme="minorHAnsi" w:cstheme="majorBidi"/>
       <w:i/>
       <w:iCs/>
       <w:color w:val="0F4761" w:themeColor="accent1" w:themeShade="BF"/>
+      <w:kern w:val="2"/>
+      <w14:ligatures w14:val="standardContextual"/>
     </w:rPr>
   </w:style>
   <w:style w:type="paragraph" w:styleId="Heading5">
@@ -1118,12 +1422,14 @@
     <w:pPr>
       <w:keepNext/>
       <w:keepLines/>
-      <w:spacing w:before="80" w:after="40"/>
+      <w:spacing w:before="80" w:after="40" w:line="278" w:lineRule="auto"/>
       <w:outlineLvl w:val="4"/>
     </w:pPr>
     <w:rPr>
-      <w:rFonts w:eastAsiaTheme="majorEastAsia" w:cstheme="majorBidi"/>
+      <w:rFonts w:asciiTheme="minorHAnsi" w:eastAsiaTheme="majorEastAsia" w:hAnsiTheme="minorHAnsi" w:cstheme="majorBidi"/>
       <w:color w:val="0F4761" w:themeColor="accent1" w:themeShade="BF"/>
+      <w:kern w:val="2"/>
+      <w14:ligatures w14:val="standardContextual"/>
     </w:rPr>
   </w:style>
   <w:style w:type="paragraph" w:styleId="Heading6">
@@ -1139,14 +1445,16 @@
     <w:pPr>
       <w:keepNext/>
       <w:keepLines/>
-      <w:spacing w:before="40" w:after="0"/>
+      <w:spacing w:before="40" w:line="278" w:lineRule="auto"/>
       <w:outlineLvl w:val="5"/>
     </w:pPr>
     <w:rPr>
-      <w:rFonts w:eastAsiaTheme="majorEastAsia" w:cstheme="majorBidi"/>
+      <w:rFonts w:asciiTheme="minorHAnsi" w:eastAsiaTheme="majorEastAsia" w:hAnsiTheme="minorHAnsi" w:cstheme="majorBidi"/>
       <w:i/>
       <w:iCs/>
       <w:color w:val="595959" w:themeColor="text1" w:themeTint="A6"/>
+      <w:kern w:val="2"/>
+      <w14:ligatures w14:val="standardContextual"/>
     </w:rPr>
   </w:style>
   <w:style w:type="paragraph" w:styleId="Heading7">
@@ -1162,12 +1470,14 @@
     <w:pPr>
       <w:keepNext/>
       <w:keepLines/>
-      <w:spacing w:before="40" w:after="0"/>
+      <w:spacing w:before="40" w:line="278" w:lineRule="auto"/>
       <w:outlineLvl w:val="6"/>
     </w:pPr>
     <w:rPr>
-      <w:rFonts w:eastAsiaTheme="majorEastAsia" w:cstheme="majorBidi"/>
+      <w:rFonts w:asciiTheme="minorHAnsi" w:eastAsiaTheme="majorEastAsia" w:hAnsiTheme="minorHAnsi" w:cstheme="majorBidi"/>
       <w:color w:val="595959" w:themeColor="text1" w:themeTint="A6"/>
+      <w:kern w:val="2"/>
+      <w14:ligatures w14:val="standardContextual"/>
     </w:rPr>
   </w:style>
   <w:style w:type="paragraph" w:styleId="Heading8">
@@ -1183,14 +1493,16 @@
     <w:pPr>
       <w:keepNext/>
       <w:keepLines/>
-      <w:spacing w:after="0"/>
+      <w:spacing w:line="278" w:lineRule="auto"/>
       <w:outlineLvl w:val="7"/>
     </w:pPr>
     <w:rPr>
-      <w:rFonts w:eastAsiaTheme="majorEastAsia" w:cstheme="majorBidi"/>
+      <w:rFonts w:asciiTheme="minorHAnsi" w:eastAsiaTheme="majorEastAsia" w:hAnsiTheme="minorHAnsi" w:cstheme="majorBidi"/>
       <w:i/>
       <w:iCs/>
       <w:color w:val="272727" w:themeColor="text1" w:themeTint="D8"/>
+      <w:kern w:val="2"/>
+      <w14:ligatures w14:val="standardContextual"/>
     </w:rPr>
   </w:style>
   <w:style w:type="paragraph" w:styleId="Heading9">
@@ -1206,12 +1518,14 @@
     <w:pPr>
       <w:keepNext/>
       <w:keepLines/>
-      <w:spacing w:after="0"/>
+      <w:spacing w:line="278" w:lineRule="auto"/>
       <w:outlineLvl w:val="8"/>
     </w:pPr>
     <w:rPr>
-      <w:rFonts w:eastAsiaTheme="majorEastAsia" w:cstheme="majorBidi"/>
+      <w:rFonts w:asciiTheme="minorHAnsi" w:eastAsiaTheme="majorEastAsia" w:hAnsiTheme="minorHAnsi" w:cstheme="majorBidi"/>
       <w:color w:val="272727" w:themeColor="text1" w:themeTint="D8"/>
+      <w:kern w:val="2"/>
+      <w14:ligatures w14:val="standardContextual"/>
     </w:rPr>
   </w:style>
   <w:style w:type="character" w:default="1" w:styleId="DefaultParagraphFont">
@@ -1369,7 +1683,7 @@
     <w:qFormat/>
     <w:rsid w:val="00BF6497"/>
     <w:pPr>
-      <w:spacing w:after="80" w:line="240" w:lineRule="auto"/>
+      <w:spacing w:after="80"/>
       <w:contextualSpacing/>
     </w:pPr>
     <w:rPr>
@@ -1378,6 +1692,7 @@
       <w:kern w:val="28"/>
       <w:sz w:val="56"/>
       <w:szCs w:val="56"/>
+      <w14:ligatures w14:val="standardContextual"/>
     </w:rPr>
   </w:style>
   <w:style w:type="character" w:customStyle="1" w:styleId="TitleChar">
@@ -1406,13 +1721,16 @@
       <w:numPr>
         <w:ilvl w:val="1"/>
       </w:numPr>
+      <w:spacing w:after="160" w:line="278" w:lineRule="auto"/>
     </w:pPr>
     <w:rPr>
-      <w:rFonts w:eastAsiaTheme="majorEastAsia" w:cstheme="majorBidi"/>
+      <w:rFonts w:asciiTheme="minorHAnsi" w:eastAsiaTheme="majorEastAsia" w:hAnsiTheme="minorHAnsi" w:cstheme="majorBidi"/>
       <w:color w:val="595959" w:themeColor="text1" w:themeTint="A6"/>
       <w:spacing w:val="15"/>
+      <w:kern w:val="2"/>
       <w:sz w:val="28"/>
       <w:szCs w:val="28"/>
+      <w14:ligatures w14:val="standardContextual"/>
     </w:rPr>
   </w:style>
   <w:style w:type="character" w:customStyle="1" w:styleId="SubtitleChar">
@@ -1438,13 +1756,16 @@
     <w:qFormat/>
     <w:rsid w:val="00BF6497"/>
     <w:pPr>
-      <w:spacing w:before="160"/>
+      <w:spacing w:before="160" w:after="160" w:line="278" w:lineRule="auto"/>
       <w:jc w:val="center"/>
     </w:pPr>
     <w:rPr>
+      <w:rFonts w:asciiTheme="minorHAnsi" w:eastAsiaTheme="minorHAnsi" w:hAnsiTheme="minorHAnsi" w:cstheme="minorBidi"/>
       <w:i/>
       <w:iCs/>
       <w:color w:val="404040" w:themeColor="text1" w:themeTint="BF"/>
+      <w:kern w:val="2"/>
+      <w14:ligatures w14:val="standardContextual"/>
     </w:rPr>
   </w:style>
   <w:style w:type="character" w:customStyle="1" w:styleId="QuoteChar">
@@ -1466,9 +1787,15 @@
     <w:qFormat/>
     <w:rsid w:val="00BF6497"/>
     <w:pPr>
+      <w:spacing w:after="160" w:line="278" w:lineRule="auto"/>
       <w:ind w:left="720"/>
       <w:contextualSpacing/>
     </w:pPr>
+    <w:rPr>
+      <w:rFonts w:asciiTheme="minorHAnsi" w:eastAsiaTheme="minorHAnsi" w:hAnsiTheme="minorHAnsi" w:cstheme="minorBidi"/>
+      <w:kern w:val="2"/>
+      <w14:ligatures w14:val="standardContextual"/>
+    </w:rPr>
   </w:style>
   <w:style w:type="character" w:styleId="IntenseEmphasis">
     <w:name w:val="Intense Emphasis"/>
@@ -1495,14 +1822,17 @@
         <w:top w:val="single" w:sz="4" w:space="10" w:color="0F4761" w:themeColor="accent1" w:themeShade="BF"/>
         <w:bottom w:val="single" w:sz="4" w:space="10" w:color="0F4761" w:themeColor="accent1" w:themeShade="BF"/>
       </w:pBdr>
-      <w:spacing w:before="360" w:after="360"/>
+      <w:spacing w:before="360" w:after="360" w:line="278" w:lineRule="auto"/>
       <w:ind w:left="864" w:right="864"/>
       <w:jc w:val="center"/>
     </w:pPr>
     <w:rPr>
+      <w:rFonts w:asciiTheme="minorHAnsi" w:eastAsiaTheme="minorHAnsi" w:hAnsiTheme="minorHAnsi" w:cstheme="minorBidi"/>
       <w:i/>
       <w:iCs/>
       <w:color w:val="0F4761" w:themeColor="accent1" w:themeShade="BF"/>
+      <w:kern w:val="2"/>
+      <w14:ligatures w14:val="standardContextual"/>
     </w:rPr>
   </w:style>
   <w:style w:type="character" w:customStyle="1" w:styleId="IntenseQuoteChar">

</xml_diff>